<commit_message>
feat: complete PIM frontend with custom UI, locale datepicker, member chips, and test docs
</commit_message>
<xml_diff>
--- a/materials/doc/On-boarding-PIMTool-Requirements-v4-Exercise.docx
+++ b/materials/doc/On-boarding-PIMTool-Requirements-v4-Exercise.docx
@@ -1,6 +1,6 @@
 
 <file path=word/document.xml><?xml version="1.0" encoding="utf-8"?>
-<w:document xmlns:wpc="http://schemas.microsoft.com/office/word/2010/wordprocessingCanvas" xmlns:cx="http://schemas.microsoft.com/office/drawing/2014/chartex" xmlns:cx1="http://schemas.microsoft.com/office/drawing/2015/9/8/chartex" xmlns:cx2="http://schemas.microsoft.com/office/drawing/2015/10/21/chartex" xmlns:cx3="http://schemas.microsoft.com/office/drawing/2016/5/9/chartex" xmlns:cx4="http://schemas.microsoft.com/office/drawing/2016/5/10/chartex" xmlns:cx5="http://schemas.microsoft.com/office/drawing/2016/5/11/chartex" xmlns:cx6="http://schemas.microsoft.com/office/drawing/2016/5/12/chartex" xmlns:cx7="http://schemas.microsoft.com/office/drawing/2016/5/13/chartex" xmlns:cx8="http://schemas.microsoft.com/office/drawing/2016/5/14/chartex" xmlns:mc="http://schemas.openxmlformats.org/markup-compatibility/2006" xmlns:aink="http://schemas.microsoft.com/office/drawing/2016/ink" xmlns:am3d="http://schemas.microsoft.com/office/drawing/2017/model3d" xmlns:o="urn:schemas-microsoft-com:office:office" xmlns:r="http://schemas.openxmlformats.org/officeDocument/2006/relationships" xmlns:m="http://schemas.openxmlformats.org/officeDocument/2006/math" xmlns:v="urn:schemas-microsoft-com:vml" xmlns:wp14="http://schemas.microsoft.com/office/word/2010/wordprocessingDrawing" xmlns:wp="http://schemas.openxmlformats.org/drawingml/2006/wordprocessingDrawing" xmlns:w10="urn:schemas-microsoft-com:office:word" xmlns:w="http://schemas.openxmlformats.org/wordprocessingml/2006/main" xmlns:w14="http://schemas.microsoft.com/office/word/2010/wordml" xmlns:w15="http://schemas.microsoft.com/office/word/2012/wordml" xmlns:w16cex="http://schemas.microsoft.com/office/word/2018/wordml/cex" xmlns:w16cid="http://schemas.microsoft.com/office/word/2016/wordml/cid" xmlns:w16="http://schemas.microsoft.com/office/word/2018/wordml" xmlns:w16sdtdh="http://schemas.microsoft.com/office/word/2020/wordml/sdtdatahash" xmlns:w16se="http://schemas.microsoft.com/office/word/2015/wordml/symex" xmlns:wpg="http://schemas.microsoft.com/office/word/2010/wordprocessingGroup" xmlns:wpi="http://schemas.microsoft.com/office/word/2010/wordprocessingInk" xmlns:wne="http://schemas.microsoft.com/office/word/2006/wordml" xmlns:wps="http://schemas.microsoft.com/office/word/2010/wordprocessingShape" mc:Ignorable="w14 w15 w16se w16cid w16 w16cex w16sdtdh wp14">
+<w:document xmlns:wpc="http://schemas.microsoft.com/office/word/2010/wordprocessingCanvas" xmlns:cx="http://schemas.microsoft.com/office/drawing/2014/chartex" xmlns:cx1="http://schemas.microsoft.com/office/drawing/2015/9/8/chartex" xmlns:cx2="http://schemas.microsoft.com/office/drawing/2015/10/21/chartex" xmlns:cx3="http://schemas.microsoft.com/office/drawing/2016/5/9/chartex" xmlns:cx4="http://schemas.microsoft.com/office/drawing/2016/5/10/chartex" xmlns:cx5="http://schemas.microsoft.com/office/drawing/2016/5/11/chartex" xmlns:cx6="http://schemas.microsoft.com/office/drawing/2016/5/12/chartex" xmlns:cx7="http://schemas.microsoft.com/office/drawing/2016/5/13/chartex" xmlns:cx8="http://schemas.microsoft.com/office/drawing/2016/5/14/chartex" xmlns:mc="http://schemas.openxmlformats.org/markup-compatibility/2006" xmlns:aink="http://schemas.microsoft.com/office/drawing/2016/ink" xmlns:am3d="http://schemas.microsoft.com/office/drawing/2017/model3d" xmlns:o="urn:schemas-microsoft-com:office:office" xmlns:oel="http://schemas.microsoft.com/office/2019/extlst" xmlns:r="http://schemas.openxmlformats.org/officeDocument/2006/relationships" xmlns:m="http://schemas.openxmlformats.org/officeDocument/2006/math" xmlns:v="urn:schemas-microsoft-com:vml" xmlns:wp14="http://schemas.microsoft.com/office/word/2010/wordprocessingDrawing" xmlns:wp="http://schemas.openxmlformats.org/drawingml/2006/wordprocessingDrawing" xmlns:w10="urn:schemas-microsoft-com:office:word" xmlns:w="http://schemas.openxmlformats.org/wordprocessingml/2006/main" xmlns:w14="http://schemas.microsoft.com/office/word/2010/wordml" xmlns:w15="http://schemas.microsoft.com/office/word/2012/wordml" xmlns:w16cex="http://schemas.microsoft.com/office/word/2018/wordml/cex" xmlns:w16cid="http://schemas.microsoft.com/office/word/2016/wordml/cid" xmlns:w16="http://schemas.microsoft.com/office/word/2018/wordml" xmlns:w16du="http://schemas.microsoft.com/office/word/2023/wordml/word16du" xmlns:w16sdtdh="http://schemas.microsoft.com/office/word/2020/wordml/sdtdatahash" xmlns:w16sdtfl="http://schemas.microsoft.com/office/word/2024/wordml/sdtformatlock" xmlns:w16se="http://schemas.microsoft.com/office/word/2015/wordml/symex" xmlns:wpg="http://schemas.microsoft.com/office/word/2010/wordprocessingGroup" xmlns:wpi="http://schemas.microsoft.com/office/word/2010/wordprocessingInk" xmlns:wne="http://schemas.microsoft.com/office/word/2006/wordml" xmlns:wps="http://schemas.microsoft.com/office/word/2010/wordprocessingShape" mc:Ignorable="w14 w15 w16se w16cid w16 w16cex w16sdtdh w16sdtfl w16du wp14">
   <w:body>
     <w:tbl>
       <w:tblPr>
@@ -540,7 +540,6 @@
         <w:tc>
           <w:tcPr>
             <w:tcW w:w="1521" w:type="dxa"/>
-            <w:shd w:val="clear" w:color="auto" w:fill="auto"/>
           </w:tcPr>
           <w:p>
             <w:pPr>
@@ -561,7 +560,6 @@
         <w:tc>
           <w:tcPr>
             <w:tcW w:w="6759" w:type="dxa"/>
-            <w:shd w:val="clear" w:color="auto" w:fill="auto"/>
           </w:tcPr>
           <w:p>
             <w:pPr>
@@ -584,7 +582,6 @@
         <w:tc>
           <w:tcPr>
             <w:tcW w:w="1521" w:type="dxa"/>
-            <w:shd w:val="clear" w:color="auto" w:fill="auto"/>
           </w:tcPr>
           <w:p>
             <w:pPr>
@@ -599,7 +596,6 @@
         <w:tc>
           <w:tcPr>
             <w:tcW w:w="6759" w:type="dxa"/>
-            <w:shd w:val="clear" w:color="auto" w:fill="auto"/>
           </w:tcPr>
           <w:p>
             <w:pPr>
@@ -1832,27 +1828,14 @@
       <w:r>
         <w:t>.</w:t>
       </w:r>
-      <w:r>
-        <w:fldChar w:fldCharType="begin"/>
-      </w:r>
-      <w:r>
-        <w:instrText xml:space="preserve"> SEQ Figure \* ARABIC \s 1 </w:instrText>
-      </w:r>
-      <w:r>
-        <w:fldChar w:fldCharType="separate"/>
-      </w:r>
-      <w:r>
-        <w:rPr>
-          <w:noProof/>
-        </w:rPr>
-        <w:t>1</w:t>
-      </w:r>
-      <w:r>
-        <w:rPr>
-          <w:noProof/>
-        </w:rPr>
-        <w:fldChar w:fldCharType="end"/>
-      </w:r>
+      <w:fldSimple w:instr=" SEQ Figure \* ARABIC \s 1 ">
+        <w:r>
+          <w:rPr>
+            <w:noProof/>
+          </w:rPr>
+          <w:t>1</w:t>
+        </w:r>
+      </w:fldSimple>
       <w:r>
         <w:t xml:space="preserve"> New project screen</w:t>
       </w:r>
@@ -2310,7 +2293,6 @@
         <w:tc>
           <w:tcPr>
             <w:tcW w:w="810" w:type="dxa"/>
-            <w:shd w:val="clear" w:color="auto" w:fill="auto"/>
           </w:tcPr>
           <w:p>
             <w:pPr>
@@ -2324,7 +2306,6 @@
         <w:tc>
           <w:tcPr>
             <w:tcW w:w="8100" w:type="dxa"/>
-            <w:shd w:val="clear" w:color="auto" w:fill="auto"/>
             <w:vAlign w:val="center"/>
           </w:tcPr>
           <w:p>
@@ -2347,7 +2328,6 @@
         <w:tc>
           <w:tcPr>
             <w:tcW w:w="540" w:type="dxa"/>
-            <w:shd w:val="clear" w:color="auto" w:fill="auto"/>
             <w:textDirection w:val="btLr"/>
             <w:vAlign w:val="center"/>
           </w:tcPr>
@@ -2372,7 +2352,6 @@
         <w:tc>
           <w:tcPr>
             <w:tcW w:w="810" w:type="dxa"/>
-            <w:shd w:val="clear" w:color="auto" w:fill="auto"/>
           </w:tcPr>
           <w:p>
             <w:pPr>
@@ -2390,7 +2369,6 @@
         <w:tc>
           <w:tcPr>
             <w:tcW w:w="8100" w:type="dxa"/>
-            <w:shd w:val="clear" w:color="auto" w:fill="auto"/>
           </w:tcPr>
           <w:p>
             <w:pPr>
@@ -2422,7 +2400,6 @@
         <w:tc>
           <w:tcPr>
             <w:tcW w:w="540" w:type="dxa"/>
-            <w:shd w:val="clear" w:color="auto" w:fill="auto"/>
           </w:tcPr>
           <w:p>
             <w:pPr>
@@ -2437,7 +2414,6 @@
         <w:tc>
           <w:tcPr>
             <w:tcW w:w="810" w:type="dxa"/>
-            <w:shd w:val="clear" w:color="auto" w:fill="auto"/>
           </w:tcPr>
           <w:p>
             <w:pPr>
@@ -2455,7 +2431,6 @@
         <w:tc>
           <w:tcPr>
             <w:tcW w:w="8100" w:type="dxa"/>
-            <w:shd w:val="clear" w:color="auto" w:fill="auto"/>
           </w:tcPr>
           <w:p>
             <w:pPr>
@@ -2506,7 +2481,6 @@
         <w:tc>
           <w:tcPr>
             <w:tcW w:w="540" w:type="dxa"/>
-            <w:shd w:val="clear" w:color="auto" w:fill="auto"/>
           </w:tcPr>
           <w:p>
             <w:pPr>
@@ -2521,7 +2495,6 @@
         <w:tc>
           <w:tcPr>
             <w:tcW w:w="810" w:type="dxa"/>
-            <w:shd w:val="clear" w:color="auto" w:fill="auto"/>
           </w:tcPr>
           <w:p>
             <w:pPr>
@@ -2539,7 +2512,6 @@
         <w:tc>
           <w:tcPr>
             <w:tcW w:w="8100" w:type="dxa"/>
-            <w:shd w:val="clear" w:color="auto" w:fill="auto"/>
           </w:tcPr>
           <w:p>
             <w:pPr>
@@ -2583,7 +2555,6 @@
         <w:tc>
           <w:tcPr>
             <w:tcW w:w="540" w:type="dxa"/>
-            <w:shd w:val="clear" w:color="auto" w:fill="auto"/>
           </w:tcPr>
           <w:p>
             <w:pPr>
@@ -3703,27 +3674,14 @@
       <w:r>
         <w:t>.</w:t>
       </w:r>
-      <w:r>
-        <w:fldChar w:fldCharType="begin"/>
-      </w:r>
-      <w:r>
-        <w:instrText xml:space="preserve"> SEQ Figure \* ARABIC \s 1 </w:instrText>
-      </w:r>
-      <w:r>
-        <w:fldChar w:fldCharType="separate"/>
-      </w:r>
-      <w:r>
-        <w:rPr>
-          <w:noProof/>
-        </w:rPr>
-        <w:t>1</w:t>
-      </w:r>
-      <w:r>
-        <w:rPr>
-          <w:noProof/>
-        </w:rPr>
-        <w:fldChar w:fldCharType="end"/>
-      </w:r>
+      <w:fldSimple w:instr=" SEQ Figure \* ARABIC \s 1 ">
+        <w:r>
+          <w:rPr>
+            <w:noProof/>
+          </w:rPr>
+          <w:t>1</w:t>
+        </w:r>
+      </w:fldSimple>
       <w:bookmarkEnd w:id="4"/>
       <w:r>
         <w:t xml:space="preserve"> Project </w:t>
@@ -4077,7 +4035,6 @@
         <w:tc>
           <w:tcPr>
             <w:tcW w:w="810" w:type="dxa"/>
-            <w:shd w:val="clear" w:color="auto" w:fill="auto"/>
           </w:tcPr>
           <w:p>
             <w:pPr>
@@ -4091,7 +4048,6 @@
         <w:tc>
           <w:tcPr>
             <w:tcW w:w="8100" w:type="dxa"/>
-            <w:shd w:val="clear" w:color="auto" w:fill="auto"/>
             <w:vAlign w:val="center"/>
           </w:tcPr>
           <w:p>
@@ -4114,7 +4070,6 @@
         <w:tc>
           <w:tcPr>
             <w:tcW w:w="540" w:type="dxa"/>
-            <w:shd w:val="clear" w:color="auto" w:fill="auto"/>
             <w:textDirection w:val="btLr"/>
             <w:vAlign w:val="center"/>
           </w:tcPr>
@@ -4139,7 +4094,6 @@
         <w:tc>
           <w:tcPr>
             <w:tcW w:w="810" w:type="dxa"/>
-            <w:shd w:val="clear" w:color="auto" w:fill="auto"/>
           </w:tcPr>
           <w:p>
             <w:pPr>
@@ -4157,7 +4111,6 @@
         <w:tc>
           <w:tcPr>
             <w:tcW w:w="8100" w:type="dxa"/>
-            <w:shd w:val="clear" w:color="auto" w:fill="auto"/>
           </w:tcPr>
           <w:p>
             <w:pPr>
@@ -4195,7 +4148,6 @@
         <w:tc>
           <w:tcPr>
             <w:tcW w:w="540" w:type="dxa"/>
-            <w:shd w:val="clear" w:color="auto" w:fill="auto"/>
           </w:tcPr>
           <w:p>
             <w:pPr>
@@ -4210,7 +4162,6 @@
         <w:tc>
           <w:tcPr>
             <w:tcW w:w="810" w:type="dxa"/>
-            <w:shd w:val="clear" w:color="auto" w:fill="auto"/>
           </w:tcPr>
           <w:p>
             <w:pPr>
@@ -4228,7 +4179,6 @@
         <w:tc>
           <w:tcPr>
             <w:tcW w:w="8100" w:type="dxa"/>
-            <w:shd w:val="clear" w:color="auto" w:fill="auto"/>
           </w:tcPr>
           <w:p>
             <w:pPr>
@@ -4278,7 +4228,6 @@
         <w:tc>
           <w:tcPr>
             <w:tcW w:w="540" w:type="dxa"/>
-            <w:shd w:val="clear" w:color="auto" w:fill="auto"/>
           </w:tcPr>
           <w:p>
             <w:pPr>
@@ -4296,7 +4245,6 @@
         <w:tc>
           <w:tcPr>
             <w:tcW w:w="810" w:type="dxa"/>
-            <w:shd w:val="clear" w:color="auto" w:fill="auto"/>
           </w:tcPr>
           <w:p>
             <w:pPr>
@@ -4314,7 +4262,6 @@
         <w:tc>
           <w:tcPr>
             <w:tcW w:w="8100" w:type="dxa"/>
-            <w:shd w:val="clear" w:color="auto" w:fill="auto"/>
           </w:tcPr>
           <w:p>
             <w:pPr>
@@ -4339,7 +4286,6 @@
         <w:tc>
           <w:tcPr>
             <w:tcW w:w="540" w:type="dxa"/>
-            <w:shd w:val="clear" w:color="auto" w:fill="auto"/>
           </w:tcPr>
           <w:p>
             <w:pPr>
@@ -4357,7 +4303,6 @@
         <w:tc>
           <w:tcPr>
             <w:tcW w:w="810" w:type="dxa"/>
-            <w:shd w:val="clear" w:color="auto" w:fill="auto"/>
           </w:tcPr>
           <w:p>
             <w:pPr>
@@ -4375,7 +4320,6 @@
         <w:tc>
           <w:tcPr>
             <w:tcW w:w="8100" w:type="dxa"/>
-            <w:shd w:val="clear" w:color="auto" w:fill="auto"/>
           </w:tcPr>
           <w:p>
             <w:pPr>
@@ -4419,7 +4363,6 @@
         <w:tc>
           <w:tcPr>
             <w:tcW w:w="540" w:type="dxa"/>
-            <w:shd w:val="clear" w:color="auto" w:fill="auto"/>
           </w:tcPr>
           <w:p>
             <w:pPr>
@@ -4438,7 +4381,6 @@
         <w:tc>
           <w:tcPr>
             <w:tcW w:w="810" w:type="dxa"/>
-            <w:shd w:val="clear" w:color="auto" w:fill="auto"/>
           </w:tcPr>
           <w:p>
             <w:pPr>
@@ -4456,7 +4398,6 @@
         <w:tc>
           <w:tcPr>
             <w:tcW w:w="8100" w:type="dxa"/>
-            <w:shd w:val="clear" w:color="auto" w:fill="auto"/>
           </w:tcPr>
           <w:p>
             <w:pPr>
@@ -4487,7 +4428,6 @@
         <w:tc>
           <w:tcPr>
             <w:tcW w:w="540" w:type="dxa"/>
-            <w:shd w:val="clear" w:color="auto" w:fill="auto"/>
           </w:tcPr>
           <w:p>
             <w:pPr>
@@ -6496,13 +6436,28 @@
         </w:numPr>
       </w:pPr>
       <w:r>
-        <w:t>Apply mu</w:t>
-      </w:r>
-      <w:r>
+        <w:t xml:space="preserve">Apply </w:t>
+      </w:r>
+      <w:r>
+        <w:rPr>
+          <w:color w:val="FF0000"/>
+        </w:rPr>
+        <w:t>mu</w:t>
+      </w:r>
+      <w:r>
+        <w:rPr>
+          <w:color w:val="FF0000"/>
+        </w:rPr>
         <w:t>l</w:t>
       </w:r>
       <w:r>
-        <w:t>tilingual for all labels, messages inside the applicatio</w:t>
+        <w:rPr>
+          <w:color w:val="FF0000"/>
+        </w:rPr>
+        <w:t xml:space="preserve">tilingual </w:t>
+      </w:r>
+      <w:r>
+        <w:t>for all labels, messages inside the applicatio</w:t>
       </w:r>
       <w:r>
         <w:t xml:space="preserve">n. </w:t>
@@ -6565,8 +6520,14 @@
           <w:ilvl w:val="0"/>
           <w:numId w:val="43"/>
         </w:numPr>
-      </w:pPr>
-      <w:r>
+        <w:rPr>
+          <w:color w:val="FF0000"/>
+        </w:rPr>
+      </w:pPr>
+      <w:r>
+        <w:rPr>
+          <w:color w:val="FF0000"/>
+        </w:rPr>
         <w:t>Changes in Spring configurations are not recommended, unless you have a good reason to.</w:t>
       </w:r>
     </w:p>
@@ -6621,7 +6582,16 @@
         </w:numPr>
       </w:pPr>
       <w:r>
-        <w:t>Entity mapping should share the id and version column from superclass.</w:t>
+        <w:t xml:space="preserve">Entity </w:t>
+      </w:r>
+      <w:r>
+        <w:rPr>
+          <w:highlight w:val="yellow"/>
+        </w:rPr>
+        <w:t>mapping should share the id and version column</w:t>
+      </w:r>
+      <w:r>
+        <w:t xml:space="preserve"> from superclass.</w:t>
       </w:r>
     </w:p>
     <w:p>
@@ -6633,7 +6603,13 @@
         </w:numPr>
       </w:pPr>
       <w:r>
-        <w:t>Pay attention to Coding Best Practices section 2 (General programming) and 3 (Exception handling).</w:t>
+        <w:t xml:space="preserve">Pay attention to </w:t>
+      </w:r>
+      <w:r>
+        <w:rPr>
+          <w:highlight w:val="yellow"/>
+        </w:rPr>
+        <w:t>Coding Best Practices section 2 (General programming) and 3 (Exception handling).</w:t>
       </w:r>
     </w:p>
     <w:p/>
@@ -6699,19 +6675,40 @@
         </w:numPr>
       </w:pPr>
       <w:r>
-        <w:t xml:space="preserve">Database tables </w:t>
-      </w:r>
-      <w:r>
+        <w:t xml:space="preserve">Database </w:t>
+      </w:r>
+      <w:r>
+        <w:rPr>
+          <w:highlight w:val="yellow"/>
+        </w:rPr>
+        <w:t xml:space="preserve">tables </w:t>
+      </w:r>
+      <w:r>
+        <w:rPr>
+          <w:highlight w:val="yellow"/>
+        </w:rPr>
         <w:t>must contain</w:t>
       </w:r>
       <w:r>
+        <w:rPr>
+          <w:highlight w:val="yellow"/>
+        </w:rPr>
         <w:t xml:space="preserve"> the</w:t>
       </w:r>
       <w:r>
+        <w:rPr>
+          <w:highlight w:val="yellow"/>
+        </w:rPr>
         <w:t xml:space="preserve"> exact</w:t>
       </w:r>
       <w:r>
-        <w:t xml:space="preserve"> columns in section 6</w:t>
+        <w:rPr>
+          <w:highlight w:val="yellow"/>
+        </w:rPr>
+        <w:t xml:space="preserve"> columns in section</w:t>
+      </w:r>
+      <w:r>
+        <w:t xml:space="preserve"> 6</w:t>
       </w:r>
       <w:r>
         <w:t>, no more no less</w:t>
@@ -6771,7 +6768,7 @@
 </file>
 
 <file path=word/endnotes.xml><?xml version="1.0" encoding="utf-8"?>
-<w:endnotes xmlns:wpc="http://schemas.microsoft.com/office/word/2010/wordprocessingCanvas" xmlns:cx="http://schemas.microsoft.com/office/drawing/2014/chartex" xmlns:cx1="http://schemas.microsoft.com/office/drawing/2015/9/8/chartex" xmlns:cx2="http://schemas.microsoft.com/office/drawing/2015/10/21/chartex" xmlns:cx3="http://schemas.microsoft.com/office/drawing/2016/5/9/chartex" xmlns:cx4="http://schemas.microsoft.com/office/drawing/2016/5/10/chartex" xmlns:cx5="http://schemas.microsoft.com/office/drawing/2016/5/11/chartex" xmlns:cx6="http://schemas.microsoft.com/office/drawing/2016/5/12/chartex" xmlns:cx7="http://schemas.microsoft.com/office/drawing/2016/5/13/chartex" xmlns:cx8="http://schemas.microsoft.com/office/drawing/2016/5/14/chartex" xmlns:mc="http://schemas.openxmlformats.org/markup-compatibility/2006" xmlns:aink="http://schemas.microsoft.com/office/drawing/2016/ink" xmlns:am3d="http://schemas.microsoft.com/office/drawing/2017/model3d" xmlns:o="urn:schemas-microsoft-com:office:office" xmlns:r="http://schemas.openxmlformats.org/officeDocument/2006/relationships" xmlns:m="http://schemas.openxmlformats.org/officeDocument/2006/math" xmlns:v="urn:schemas-microsoft-com:vml" xmlns:wp14="http://schemas.microsoft.com/office/word/2010/wordprocessingDrawing" xmlns:wp="http://schemas.openxmlformats.org/drawingml/2006/wordprocessingDrawing" xmlns:w10="urn:schemas-microsoft-com:office:word" xmlns:w="http://schemas.openxmlformats.org/wordprocessingml/2006/main" xmlns:w14="http://schemas.microsoft.com/office/word/2010/wordml" xmlns:w15="http://schemas.microsoft.com/office/word/2012/wordml" xmlns:w16cex="http://schemas.microsoft.com/office/word/2018/wordml/cex" xmlns:w16cid="http://schemas.microsoft.com/office/word/2016/wordml/cid" xmlns:w16="http://schemas.microsoft.com/office/word/2018/wordml" xmlns:w16sdtdh="http://schemas.microsoft.com/office/word/2020/wordml/sdtdatahash" xmlns:w16se="http://schemas.microsoft.com/office/word/2015/wordml/symex" xmlns:wpg="http://schemas.microsoft.com/office/word/2010/wordprocessingGroup" xmlns:wpi="http://schemas.microsoft.com/office/word/2010/wordprocessingInk" xmlns:wne="http://schemas.microsoft.com/office/word/2006/wordml" xmlns:wps="http://schemas.microsoft.com/office/word/2010/wordprocessingShape" mc:Ignorable="w14 w15 w16se w16cid w16 w16cex w16sdtdh wp14">
+<w:endnotes xmlns:wpc="http://schemas.microsoft.com/office/word/2010/wordprocessingCanvas" xmlns:cx="http://schemas.microsoft.com/office/drawing/2014/chartex" xmlns:cx1="http://schemas.microsoft.com/office/drawing/2015/9/8/chartex" xmlns:cx2="http://schemas.microsoft.com/office/drawing/2015/10/21/chartex" xmlns:cx3="http://schemas.microsoft.com/office/drawing/2016/5/9/chartex" xmlns:cx4="http://schemas.microsoft.com/office/drawing/2016/5/10/chartex" xmlns:cx5="http://schemas.microsoft.com/office/drawing/2016/5/11/chartex" xmlns:cx6="http://schemas.microsoft.com/office/drawing/2016/5/12/chartex" xmlns:cx7="http://schemas.microsoft.com/office/drawing/2016/5/13/chartex" xmlns:cx8="http://schemas.microsoft.com/office/drawing/2016/5/14/chartex" xmlns:mc="http://schemas.openxmlformats.org/markup-compatibility/2006" xmlns:aink="http://schemas.microsoft.com/office/drawing/2016/ink" xmlns:am3d="http://schemas.microsoft.com/office/drawing/2017/model3d" xmlns:o="urn:schemas-microsoft-com:office:office" xmlns:oel="http://schemas.microsoft.com/office/2019/extlst" xmlns:r="http://schemas.openxmlformats.org/officeDocument/2006/relationships" xmlns:m="http://schemas.openxmlformats.org/officeDocument/2006/math" xmlns:v="urn:schemas-microsoft-com:vml" xmlns:wp14="http://schemas.microsoft.com/office/word/2010/wordprocessingDrawing" xmlns:wp="http://schemas.openxmlformats.org/drawingml/2006/wordprocessingDrawing" xmlns:w10="urn:schemas-microsoft-com:office:word" xmlns:w="http://schemas.openxmlformats.org/wordprocessingml/2006/main" xmlns:w14="http://schemas.microsoft.com/office/word/2010/wordml" xmlns:w15="http://schemas.microsoft.com/office/word/2012/wordml" xmlns:w16cex="http://schemas.microsoft.com/office/word/2018/wordml/cex" xmlns:w16cid="http://schemas.microsoft.com/office/word/2016/wordml/cid" xmlns:w16="http://schemas.microsoft.com/office/word/2018/wordml" xmlns:w16du="http://schemas.microsoft.com/office/word/2023/wordml/word16du" xmlns:w16sdtdh="http://schemas.microsoft.com/office/word/2020/wordml/sdtdatahash" xmlns:w16sdtfl="http://schemas.microsoft.com/office/word/2024/wordml/sdtformatlock" xmlns:w16se="http://schemas.microsoft.com/office/word/2015/wordml/symex" xmlns:wpg="http://schemas.microsoft.com/office/word/2010/wordprocessingGroup" xmlns:wpi="http://schemas.microsoft.com/office/word/2010/wordprocessingInk" xmlns:wne="http://schemas.microsoft.com/office/word/2006/wordml" xmlns:wps="http://schemas.microsoft.com/office/word/2010/wordprocessingShape" mc:Ignorable="w14 w15 w16se w16cid w16 w16cex w16sdtdh w16sdtfl w16du wp14">
   <w:endnote w:type="separator" w:id="-1">
     <w:p>
       <w:r>
@@ -6790,7 +6787,7 @@
 </file>
 
 <file path=word/footer1.xml><?xml version="1.0" encoding="utf-8"?>
-<w:ftr xmlns:wpc="http://schemas.microsoft.com/office/word/2010/wordprocessingCanvas" xmlns:cx="http://schemas.microsoft.com/office/drawing/2014/chartex" xmlns:cx1="http://schemas.microsoft.com/office/drawing/2015/9/8/chartex" xmlns:cx2="http://schemas.microsoft.com/office/drawing/2015/10/21/chartex" xmlns:cx3="http://schemas.microsoft.com/office/drawing/2016/5/9/chartex" xmlns:cx4="http://schemas.microsoft.com/office/drawing/2016/5/10/chartex" xmlns:cx5="http://schemas.microsoft.com/office/drawing/2016/5/11/chartex" xmlns:cx6="http://schemas.microsoft.com/office/drawing/2016/5/12/chartex" xmlns:cx7="http://schemas.microsoft.com/office/drawing/2016/5/13/chartex" xmlns:cx8="http://schemas.microsoft.com/office/drawing/2016/5/14/chartex" xmlns:mc="http://schemas.openxmlformats.org/markup-compatibility/2006" xmlns:aink="http://schemas.microsoft.com/office/drawing/2016/ink" xmlns:am3d="http://schemas.microsoft.com/office/drawing/2017/model3d" xmlns:o="urn:schemas-microsoft-com:office:office" xmlns:r="http://schemas.openxmlformats.org/officeDocument/2006/relationships" xmlns:m="http://schemas.openxmlformats.org/officeDocument/2006/math" xmlns:v="urn:schemas-microsoft-com:vml" xmlns:wp14="http://schemas.microsoft.com/office/word/2010/wordprocessingDrawing" xmlns:wp="http://schemas.openxmlformats.org/drawingml/2006/wordprocessingDrawing" xmlns:w10="urn:schemas-microsoft-com:office:word" xmlns:w="http://schemas.openxmlformats.org/wordprocessingml/2006/main" xmlns:w14="http://schemas.microsoft.com/office/word/2010/wordml" xmlns:w15="http://schemas.microsoft.com/office/word/2012/wordml" xmlns:w16cex="http://schemas.microsoft.com/office/word/2018/wordml/cex" xmlns:w16cid="http://schemas.microsoft.com/office/word/2016/wordml/cid" xmlns:w16="http://schemas.microsoft.com/office/word/2018/wordml" xmlns:w16sdtdh="http://schemas.microsoft.com/office/word/2020/wordml/sdtdatahash" xmlns:w16se="http://schemas.microsoft.com/office/word/2015/wordml/symex" xmlns:wpg="http://schemas.microsoft.com/office/word/2010/wordprocessingGroup" xmlns:wpi="http://schemas.microsoft.com/office/word/2010/wordprocessingInk" xmlns:wne="http://schemas.microsoft.com/office/word/2006/wordml" xmlns:wps="http://schemas.microsoft.com/office/word/2010/wordprocessingShape" mc:Ignorable="w14 w15 w16se w16cid w16 w16cex w16sdtdh wp14">
+<w:ftr xmlns:wpc="http://schemas.microsoft.com/office/word/2010/wordprocessingCanvas" xmlns:cx="http://schemas.microsoft.com/office/drawing/2014/chartex" xmlns:cx1="http://schemas.microsoft.com/office/drawing/2015/9/8/chartex" xmlns:cx2="http://schemas.microsoft.com/office/drawing/2015/10/21/chartex" xmlns:cx3="http://schemas.microsoft.com/office/drawing/2016/5/9/chartex" xmlns:cx4="http://schemas.microsoft.com/office/drawing/2016/5/10/chartex" xmlns:cx5="http://schemas.microsoft.com/office/drawing/2016/5/11/chartex" xmlns:cx6="http://schemas.microsoft.com/office/drawing/2016/5/12/chartex" xmlns:cx7="http://schemas.microsoft.com/office/drawing/2016/5/13/chartex" xmlns:cx8="http://schemas.microsoft.com/office/drawing/2016/5/14/chartex" xmlns:mc="http://schemas.openxmlformats.org/markup-compatibility/2006" xmlns:aink="http://schemas.microsoft.com/office/drawing/2016/ink" xmlns:am3d="http://schemas.microsoft.com/office/drawing/2017/model3d" xmlns:o="urn:schemas-microsoft-com:office:office" xmlns:oel="http://schemas.microsoft.com/office/2019/extlst" xmlns:r="http://schemas.openxmlformats.org/officeDocument/2006/relationships" xmlns:m="http://schemas.openxmlformats.org/officeDocument/2006/math" xmlns:v="urn:schemas-microsoft-com:vml" xmlns:wp14="http://schemas.microsoft.com/office/word/2010/wordprocessingDrawing" xmlns:wp="http://schemas.openxmlformats.org/drawingml/2006/wordprocessingDrawing" xmlns:w10="urn:schemas-microsoft-com:office:word" xmlns:w="http://schemas.openxmlformats.org/wordprocessingml/2006/main" xmlns:w14="http://schemas.microsoft.com/office/word/2010/wordml" xmlns:w15="http://schemas.microsoft.com/office/word/2012/wordml" xmlns:w16cex="http://schemas.microsoft.com/office/word/2018/wordml/cex" xmlns:w16cid="http://schemas.microsoft.com/office/word/2016/wordml/cid" xmlns:w16="http://schemas.microsoft.com/office/word/2018/wordml" xmlns:w16du="http://schemas.microsoft.com/office/word/2023/wordml/word16du" xmlns:w16sdtdh="http://schemas.microsoft.com/office/word/2020/wordml/sdtdatahash" xmlns:w16sdtfl="http://schemas.microsoft.com/office/word/2024/wordml/sdtformatlock" xmlns:w16se="http://schemas.microsoft.com/office/word/2015/wordml/symex" xmlns:wpg="http://schemas.microsoft.com/office/word/2010/wordprocessingGroup" xmlns:wpi="http://schemas.microsoft.com/office/word/2010/wordprocessingInk" xmlns:wne="http://schemas.microsoft.com/office/word/2006/wordml" xmlns:wps="http://schemas.microsoft.com/office/word/2010/wordprocessingShape" mc:Ignorable="w14 w15 w16se w16cid w16 w16cex w16sdtdh w16sdtfl w16du wp14">
   <w:p>
     <w:pPr>
       <w:pStyle w:val="Footer"/>
@@ -6812,8 +6809,8 @@
       </w:rPr>
       <w:t xml:space="preserve"> ELCA Information Technology (</w:t>
     </w:r>
-    <w:smartTag w:uri="urn:schemas-microsoft-com:office:smarttags" w:element="country-region">
-      <w:smartTag w:uri="urn:schemas-microsoft-com:office:smarttags" w:element="place">
+    <w:smartTag w:uri="urn:schemas-microsoft-com:office:smarttags" w:element="place">
+      <w:smartTag w:uri="urn:schemas-microsoft-com:office:smarttags" w:element="country-region">
         <w:r>
           <w:rPr>
             <w:sz w:val="16"/>
@@ -6913,7 +6910,7 @@
 </file>
 
 <file path=word/footer2.xml><?xml version="1.0" encoding="utf-8"?>
-<w:ftr xmlns:wpc="http://schemas.microsoft.com/office/word/2010/wordprocessingCanvas" xmlns:cx="http://schemas.microsoft.com/office/drawing/2014/chartex" xmlns:cx1="http://schemas.microsoft.com/office/drawing/2015/9/8/chartex" xmlns:cx2="http://schemas.microsoft.com/office/drawing/2015/10/21/chartex" xmlns:cx3="http://schemas.microsoft.com/office/drawing/2016/5/9/chartex" xmlns:cx4="http://schemas.microsoft.com/office/drawing/2016/5/10/chartex" xmlns:cx5="http://schemas.microsoft.com/office/drawing/2016/5/11/chartex" xmlns:cx6="http://schemas.microsoft.com/office/drawing/2016/5/12/chartex" xmlns:cx7="http://schemas.microsoft.com/office/drawing/2016/5/13/chartex" xmlns:cx8="http://schemas.microsoft.com/office/drawing/2016/5/14/chartex" xmlns:mc="http://schemas.openxmlformats.org/markup-compatibility/2006" xmlns:aink="http://schemas.microsoft.com/office/drawing/2016/ink" xmlns:am3d="http://schemas.microsoft.com/office/drawing/2017/model3d" xmlns:o="urn:schemas-microsoft-com:office:office" xmlns:r="http://schemas.openxmlformats.org/officeDocument/2006/relationships" xmlns:m="http://schemas.openxmlformats.org/officeDocument/2006/math" xmlns:v="urn:schemas-microsoft-com:vml" xmlns:wp14="http://schemas.microsoft.com/office/word/2010/wordprocessingDrawing" xmlns:wp="http://schemas.openxmlformats.org/drawingml/2006/wordprocessingDrawing" xmlns:w10="urn:schemas-microsoft-com:office:word" xmlns:w="http://schemas.openxmlformats.org/wordprocessingml/2006/main" xmlns:w14="http://schemas.microsoft.com/office/word/2010/wordml" xmlns:w15="http://schemas.microsoft.com/office/word/2012/wordml" xmlns:w16cex="http://schemas.microsoft.com/office/word/2018/wordml/cex" xmlns:w16cid="http://schemas.microsoft.com/office/word/2016/wordml/cid" xmlns:w16="http://schemas.microsoft.com/office/word/2018/wordml" xmlns:w16sdtdh="http://schemas.microsoft.com/office/word/2020/wordml/sdtdatahash" xmlns:w16se="http://schemas.microsoft.com/office/word/2015/wordml/symex" xmlns:wpg="http://schemas.microsoft.com/office/word/2010/wordprocessingGroup" xmlns:wpi="http://schemas.microsoft.com/office/word/2010/wordprocessingInk" xmlns:wne="http://schemas.microsoft.com/office/word/2006/wordml" xmlns:wps="http://schemas.microsoft.com/office/word/2010/wordprocessingShape" mc:Ignorable="w14 w15 w16se w16cid w16 w16cex w16sdtdh wp14">
+<w:ftr xmlns:wpc="http://schemas.microsoft.com/office/word/2010/wordprocessingCanvas" xmlns:cx="http://schemas.microsoft.com/office/drawing/2014/chartex" xmlns:cx1="http://schemas.microsoft.com/office/drawing/2015/9/8/chartex" xmlns:cx2="http://schemas.microsoft.com/office/drawing/2015/10/21/chartex" xmlns:cx3="http://schemas.microsoft.com/office/drawing/2016/5/9/chartex" xmlns:cx4="http://schemas.microsoft.com/office/drawing/2016/5/10/chartex" xmlns:cx5="http://schemas.microsoft.com/office/drawing/2016/5/11/chartex" xmlns:cx6="http://schemas.microsoft.com/office/drawing/2016/5/12/chartex" xmlns:cx7="http://schemas.microsoft.com/office/drawing/2016/5/13/chartex" xmlns:cx8="http://schemas.microsoft.com/office/drawing/2016/5/14/chartex" xmlns:mc="http://schemas.openxmlformats.org/markup-compatibility/2006" xmlns:aink="http://schemas.microsoft.com/office/drawing/2016/ink" xmlns:am3d="http://schemas.microsoft.com/office/drawing/2017/model3d" xmlns:o="urn:schemas-microsoft-com:office:office" xmlns:oel="http://schemas.microsoft.com/office/2019/extlst" xmlns:r="http://schemas.openxmlformats.org/officeDocument/2006/relationships" xmlns:m="http://schemas.openxmlformats.org/officeDocument/2006/math" xmlns:v="urn:schemas-microsoft-com:vml" xmlns:wp14="http://schemas.microsoft.com/office/word/2010/wordprocessingDrawing" xmlns:wp="http://schemas.openxmlformats.org/drawingml/2006/wordprocessingDrawing" xmlns:w10="urn:schemas-microsoft-com:office:word" xmlns:w="http://schemas.openxmlformats.org/wordprocessingml/2006/main" xmlns:w14="http://schemas.microsoft.com/office/word/2010/wordml" xmlns:w15="http://schemas.microsoft.com/office/word/2012/wordml" xmlns:w16cex="http://schemas.microsoft.com/office/word/2018/wordml/cex" xmlns:w16cid="http://schemas.microsoft.com/office/word/2016/wordml/cid" xmlns:w16="http://schemas.microsoft.com/office/word/2018/wordml" xmlns:w16du="http://schemas.microsoft.com/office/word/2023/wordml/word16du" xmlns:w16sdtdh="http://schemas.microsoft.com/office/word/2020/wordml/sdtdatahash" xmlns:w16sdtfl="http://schemas.microsoft.com/office/word/2024/wordml/sdtformatlock" xmlns:w16se="http://schemas.microsoft.com/office/word/2015/wordml/symex" xmlns:wpg="http://schemas.microsoft.com/office/word/2010/wordprocessingGroup" xmlns:wpi="http://schemas.microsoft.com/office/word/2010/wordprocessingInk" xmlns:wne="http://schemas.microsoft.com/office/word/2006/wordml" xmlns:wps="http://schemas.microsoft.com/office/word/2010/wordprocessingShape" mc:Ignorable="w14 w15 w16se w16cid w16 w16cex w16sdtdh w16sdtfl w16du wp14">
   <w:p>
     <w:pPr>
       <w:pStyle w:val="Footer"/>
@@ -6938,8 +6935,8 @@
       </w:rPr>
       <w:t xml:space="preserve"> ELCA Information Technology (</w:t>
     </w:r>
-    <w:smartTag w:uri="urn:schemas-microsoft-com:office:smarttags" w:element="country-region">
-      <w:smartTag w:uri="urn:schemas-microsoft-com:office:smarttags" w:element="place">
+    <w:smartTag w:uri="urn:schemas-microsoft-com:office:smarttags" w:element="place">
+      <w:smartTag w:uri="urn:schemas-microsoft-com:office:smarttags" w:element="country-region">
         <w:r>
           <w:rPr>
             <w:sz w:val="16"/>
@@ -7107,7 +7104,7 @@
 </file>
 
 <file path=word/footnotes.xml><?xml version="1.0" encoding="utf-8"?>
-<w:footnotes xmlns:wpc="http://schemas.microsoft.com/office/word/2010/wordprocessingCanvas" xmlns:cx="http://schemas.microsoft.com/office/drawing/2014/chartex" xmlns:cx1="http://schemas.microsoft.com/office/drawing/2015/9/8/chartex" xmlns:cx2="http://schemas.microsoft.com/office/drawing/2015/10/21/chartex" xmlns:cx3="http://schemas.microsoft.com/office/drawing/2016/5/9/chartex" xmlns:cx4="http://schemas.microsoft.com/office/drawing/2016/5/10/chartex" xmlns:cx5="http://schemas.microsoft.com/office/drawing/2016/5/11/chartex" xmlns:cx6="http://schemas.microsoft.com/office/drawing/2016/5/12/chartex" xmlns:cx7="http://schemas.microsoft.com/office/drawing/2016/5/13/chartex" xmlns:cx8="http://schemas.microsoft.com/office/drawing/2016/5/14/chartex" xmlns:mc="http://schemas.openxmlformats.org/markup-compatibility/2006" xmlns:aink="http://schemas.microsoft.com/office/drawing/2016/ink" xmlns:am3d="http://schemas.microsoft.com/office/drawing/2017/model3d" xmlns:o="urn:schemas-microsoft-com:office:office" xmlns:r="http://schemas.openxmlformats.org/officeDocument/2006/relationships" xmlns:m="http://schemas.openxmlformats.org/officeDocument/2006/math" xmlns:v="urn:schemas-microsoft-com:vml" xmlns:wp14="http://schemas.microsoft.com/office/word/2010/wordprocessingDrawing" xmlns:wp="http://schemas.openxmlformats.org/drawingml/2006/wordprocessingDrawing" xmlns:w10="urn:schemas-microsoft-com:office:word" xmlns:w="http://schemas.openxmlformats.org/wordprocessingml/2006/main" xmlns:w14="http://schemas.microsoft.com/office/word/2010/wordml" xmlns:w15="http://schemas.microsoft.com/office/word/2012/wordml" xmlns:w16cex="http://schemas.microsoft.com/office/word/2018/wordml/cex" xmlns:w16cid="http://schemas.microsoft.com/office/word/2016/wordml/cid" xmlns:w16="http://schemas.microsoft.com/office/word/2018/wordml" xmlns:w16sdtdh="http://schemas.microsoft.com/office/word/2020/wordml/sdtdatahash" xmlns:w16se="http://schemas.microsoft.com/office/word/2015/wordml/symex" xmlns:wpg="http://schemas.microsoft.com/office/word/2010/wordprocessingGroup" xmlns:wpi="http://schemas.microsoft.com/office/word/2010/wordprocessingInk" xmlns:wne="http://schemas.microsoft.com/office/word/2006/wordml" xmlns:wps="http://schemas.microsoft.com/office/word/2010/wordprocessingShape" mc:Ignorable="w14 w15 w16se w16cid w16 w16cex w16sdtdh wp14">
+<w:footnotes xmlns:wpc="http://schemas.microsoft.com/office/word/2010/wordprocessingCanvas" xmlns:cx="http://schemas.microsoft.com/office/drawing/2014/chartex" xmlns:cx1="http://schemas.microsoft.com/office/drawing/2015/9/8/chartex" xmlns:cx2="http://schemas.microsoft.com/office/drawing/2015/10/21/chartex" xmlns:cx3="http://schemas.microsoft.com/office/drawing/2016/5/9/chartex" xmlns:cx4="http://schemas.microsoft.com/office/drawing/2016/5/10/chartex" xmlns:cx5="http://schemas.microsoft.com/office/drawing/2016/5/11/chartex" xmlns:cx6="http://schemas.microsoft.com/office/drawing/2016/5/12/chartex" xmlns:cx7="http://schemas.microsoft.com/office/drawing/2016/5/13/chartex" xmlns:cx8="http://schemas.microsoft.com/office/drawing/2016/5/14/chartex" xmlns:mc="http://schemas.openxmlformats.org/markup-compatibility/2006" xmlns:aink="http://schemas.microsoft.com/office/drawing/2016/ink" xmlns:am3d="http://schemas.microsoft.com/office/drawing/2017/model3d" xmlns:o="urn:schemas-microsoft-com:office:office" xmlns:oel="http://schemas.microsoft.com/office/2019/extlst" xmlns:r="http://schemas.openxmlformats.org/officeDocument/2006/relationships" xmlns:m="http://schemas.openxmlformats.org/officeDocument/2006/math" xmlns:v="urn:schemas-microsoft-com:vml" xmlns:wp14="http://schemas.microsoft.com/office/word/2010/wordprocessingDrawing" xmlns:wp="http://schemas.openxmlformats.org/drawingml/2006/wordprocessingDrawing" xmlns:w10="urn:schemas-microsoft-com:office:word" xmlns:w="http://schemas.openxmlformats.org/wordprocessingml/2006/main" xmlns:w14="http://schemas.microsoft.com/office/word/2010/wordml" xmlns:w15="http://schemas.microsoft.com/office/word/2012/wordml" xmlns:w16cex="http://schemas.microsoft.com/office/word/2018/wordml/cex" xmlns:w16cid="http://schemas.microsoft.com/office/word/2016/wordml/cid" xmlns:w16="http://schemas.microsoft.com/office/word/2018/wordml" xmlns:w16du="http://schemas.microsoft.com/office/word/2023/wordml/word16du" xmlns:w16sdtdh="http://schemas.microsoft.com/office/word/2020/wordml/sdtdatahash" xmlns:w16sdtfl="http://schemas.microsoft.com/office/word/2024/wordml/sdtformatlock" xmlns:w16se="http://schemas.microsoft.com/office/word/2015/wordml/symex" xmlns:wpg="http://schemas.microsoft.com/office/word/2010/wordprocessingGroup" xmlns:wpi="http://schemas.microsoft.com/office/word/2010/wordprocessingInk" xmlns:wne="http://schemas.microsoft.com/office/word/2006/wordml" xmlns:wps="http://schemas.microsoft.com/office/word/2010/wordprocessingShape" mc:Ignorable="w14 w15 w16se w16cid w16 w16cex w16sdtdh w16sdtfl w16du wp14">
   <w:footnote w:type="separator" w:id="-1">
     <w:p>
       <w:r>
@@ -7126,7 +7123,7 @@
 </file>
 
 <file path=word/header1.xml><?xml version="1.0" encoding="utf-8"?>
-<w:hdr xmlns:wpc="http://schemas.microsoft.com/office/word/2010/wordprocessingCanvas" xmlns:cx="http://schemas.microsoft.com/office/drawing/2014/chartex" xmlns:cx1="http://schemas.microsoft.com/office/drawing/2015/9/8/chartex" xmlns:cx2="http://schemas.microsoft.com/office/drawing/2015/10/21/chartex" xmlns:cx3="http://schemas.microsoft.com/office/drawing/2016/5/9/chartex" xmlns:cx4="http://schemas.microsoft.com/office/drawing/2016/5/10/chartex" xmlns:cx5="http://schemas.microsoft.com/office/drawing/2016/5/11/chartex" xmlns:cx6="http://schemas.microsoft.com/office/drawing/2016/5/12/chartex" xmlns:cx7="http://schemas.microsoft.com/office/drawing/2016/5/13/chartex" xmlns:cx8="http://schemas.microsoft.com/office/drawing/2016/5/14/chartex" xmlns:mc="http://schemas.openxmlformats.org/markup-compatibility/2006" xmlns:aink="http://schemas.microsoft.com/office/drawing/2016/ink" xmlns:am3d="http://schemas.microsoft.com/office/drawing/2017/model3d" xmlns:o="urn:schemas-microsoft-com:office:office" xmlns:r="http://schemas.openxmlformats.org/officeDocument/2006/relationships" xmlns:m="http://schemas.openxmlformats.org/officeDocument/2006/math" xmlns:v="urn:schemas-microsoft-com:vml" xmlns:wp14="http://schemas.microsoft.com/office/word/2010/wordprocessingDrawing" xmlns:wp="http://schemas.openxmlformats.org/drawingml/2006/wordprocessingDrawing" xmlns:w10="urn:schemas-microsoft-com:office:word" xmlns:w="http://schemas.openxmlformats.org/wordprocessingml/2006/main" xmlns:w14="http://schemas.microsoft.com/office/word/2010/wordml" xmlns:w15="http://schemas.microsoft.com/office/word/2012/wordml" xmlns:w16cex="http://schemas.microsoft.com/office/word/2018/wordml/cex" xmlns:w16cid="http://schemas.microsoft.com/office/word/2016/wordml/cid" xmlns:w16="http://schemas.microsoft.com/office/word/2018/wordml" xmlns:w16sdtdh="http://schemas.microsoft.com/office/word/2020/wordml/sdtdatahash" xmlns:w16se="http://schemas.microsoft.com/office/word/2015/wordml/symex" xmlns:wpg="http://schemas.microsoft.com/office/word/2010/wordprocessingGroup" xmlns:wpi="http://schemas.microsoft.com/office/word/2010/wordprocessingInk" xmlns:wne="http://schemas.microsoft.com/office/word/2006/wordml" xmlns:wps="http://schemas.microsoft.com/office/word/2010/wordprocessingShape" mc:Ignorable="w14 w15 w16se w16cid w16 w16cex w16sdtdh wp14">
+<w:hdr xmlns:wpc="http://schemas.microsoft.com/office/word/2010/wordprocessingCanvas" xmlns:cx="http://schemas.microsoft.com/office/drawing/2014/chartex" xmlns:cx1="http://schemas.microsoft.com/office/drawing/2015/9/8/chartex" xmlns:cx2="http://schemas.microsoft.com/office/drawing/2015/10/21/chartex" xmlns:cx3="http://schemas.microsoft.com/office/drawing/2016/5/9/chartex" xmlns:cx4="http://schemas.microsoft.com/office/drawing/2016/5/10/chartex" xmlns:cx5="http://schemas.microsoft.com/office/drawing/2016/5/11/chartex" xmlns:cx6="http://schemas.microsoft.com/office/drawing/2016/5/12/chartex" xmlns:cx7="http://schemas.microsoft.com/office/drawing/2016/5/13/chartex" xmlns:cx8="http://schemas.microsoft.com/office/drawing/2016/5/14/chartex" xmlns:mc="http://schemas.openxmlformats.org/markup-compatibility/2006" xmlns:aink="http://schemas.microsoft.com/office/drawing/2016/ink" xmlns:am3d="http://schemas.microsoft.com/office/drawing/2017/model3d" xmlns:o="urn:schemas-microsoft-com:office:office" xmlns:oel="http://schemas.microsoft.com/office/2019/extlst" xmlns:r="http://schemas.openxmlformats.org/officeDocument/2006/relationships" xmlns:m="http://schemas.openxmlformats.org/officeDocument/2006/math" xmlns:v="urn:schemas-microsoft-com:vml" xmlns:wp14="http://schemas.microsoft.com/office/word/2010/wordprocessingDrawing" xmlns:wp="http://schemas.openxmlformats.org/drawingml/2006/wordprocessingDrawing" xmlns:w10="urn:schemas-microsoft-com:office:word" xmlns:w="http://schemas.openxmlformats.org/wordprocessingml/2006/main" xmlns:w14="http://schemas.microsoft.com/office/word/2010/wordml" xmlns:w15="http://schemas.microsoft.com/office/word/2012/wordml" xmlns:w16cex="http://schemas.microsoft.com/office/word/2018/wordml/cex" xmlns:w16cid="http://schemas.microsoft.com/office/word/2016/wordml/cid" xmlns:w16="http://schemas.microsoft.com/office/word/2018/wordml" xmlns:w16du="http://schemas.microsoft.com/office/word/2023/wordml/word16du" xmlns:w16sdtdh="http://schemas.microsoft.com/office/word/2020/wordml/sdtdatahash" xmlns:w16sdtfl="http://schemas.microsoft.com/office/word/2024/wordml/sdtformatlock" xmlns:w16se="http://schemas.microsoft.com/office/word/2015/wordml/symex" xmlns:wpg="http://schemas.microsoft.com/office/word/2010/wordprocessingGroup" xmlns:wpi="http://schemas.microsoft.com/office/word/2010/wordprocessingInk" xmlns:wne="http://schemas.microsoft.com/office/word/2006/wordml" xmlns:wps="http://schemas.microsoft.com/office/word/2010/wordprocessingShape" mc:Ignorable="w14 w15 w16se w16cid w16 w16cex w16sdtdh w16sdtfl w16du wp14">
   <w:p>
     <w:pPr>
       <w:pStyle w:val="Header"/>
@@ -7158,11 +7155,11 @@
           <v:path o:extrusionok="f" gradientshapeok="t" o:connecttype="rect"/>
           <o:lock v:ext="edit" aspectratio="t"/>
         </v:shapetype>
-        <v:shape id="_x0000_s2049" type="#_x0000_t75" style="position:absolute;left:0;text-align:left;margin-left:70.9pt;margin-top:37.45pt;width:51.5pt;height:51.5pt;z-index:-251659264;visibility:visible;mso-wrap-edited:f;mso-position-horizontal-relative:page;mso-position-vertical-relative:page" wrapcoords="-223 0 -223 21377 21600 21377 21600 0 -223 0" o:allowincell="f" fillcolor="window">
+        <v:shape id="_x0000_s1025" type="#_x0000_t75" style="position:absolute;left:0;text-align:left;margin-left:70.9pt;margin-top:37.45pt;width:51.5pt;height:51.5pt;z-index:-251659264;visibility:visible;mso-wrap-edited:f;mso-position-horizontal-relative:page;mso-position-vertical-relative:page" wrapcoords="-223 0 -223 21377 21600 21377 21600 0 -223 0" o:allowincell="f" fillcolor="window">
           <v:imagedata r:id="rId1" o:title=""/>
           <w10:wrap anchorx="page" anchory="page"/>
         </v:shape>
-        <o:OLEObject Type="Embed" ProgID="Word.Picture.8" ShapeID="_x0000_s2049" DrawAspect="Content" ObjectID="_1682948485" r:id="rId2"/>
+        <o:OLEObject Type="Embed" ProgID="Word.Picture.8" ShapeID="_x0000_s1025" DrawAspect="Content" ObjectID="_1851487189" r:id="rId2"/>
       </w:object>
     </w:r>
     <w:r>
@@ -7188,7 +7185,7 @@
 </file>
 
 <file path=word/header2.xml><?xml version="1.0" encoding="utf-8"?>
-<w:hdr xmlns:wpc="http://schemas.microsoft.com/office/word/2010/wordprocessingCanvas" xmlns:cx="http://schemas.microsoft.com/office/drawing/2014/chartex" xmlns:cx1="http://schemas.microsoft.com/office/drawing/2015/9/8/chartex" xmlns:cx2="http://schemas.microsoft.com/office/drawing/2015/10/21/chartex" xmlns:cx3="http://schemas.microsoft.com/office/drawing/2016/5/9/chartex" xmlns:cx4="http://schemas.microsoft.com/office/drawing/2016/5/10/chartex" xmlns:cx5="http://schemas.microsoft.com/office/drawing/2016/5/11/chartex" xmlns:cx6="http://schemas.microsoft.com/office/drawing/2016/5/12/chartex" xmlns:cx7="http://schemas.microsoft.com/office/drawing/2016/5/13/chartex" xmlns:cx8="http://schemas.microsoft.com/office/drawing/2016/5/14/chartex" xmlns:mc="http://schemas.openxmlformats.org/markup-compatibility/2006" xmlns:aink="http://schemas.microsoft.com/office/drawing/2016/ink" xmlns:am3d="http://schemas.microsoft.com/office/drawing/2017/model3d" xmlns:o="urn:schemas-microsoft-com:office:office" xmlns:r="http://schemas.openxmlformats.org/officeDocument/2006/relationships" xmlns:m="http://schemas.openxmlformats.org/officeDocument/2006/math" xmlns:v="urn:schemas-microsoft-com:vml" xmlns:wp14="http://schemas.microsoft.com/office/word/2010/wordprocessingDrawing" xmlns:wp="http://schemas.openxmlformats.org/drawingml/2006/wordprocessingDrawing" xmlns:w10="urn:schemas-microsoft-com:office:word" xmlns:w="http://schemas.openxmlformats.org/wordprocessingml/2006/main" xmlns:w14="http://schemas.microsoft.com/office/word/2010/wordml" xmlns:w15="http://schemas.microsoft.com/office/word/2012/wordml" xmlns:w16cex="http://schemas.microsoft.com/office/word/2018/wordml/cex" xmlns:w16cid="http://schemas.microsoft.com/office/word/2016/wordml/cid" xmlns:w16="http://schemas.microsoft.com/office/word/2018/wordml" xmlns:w16sdtdh="http://schemas.microsoft.com/office/word/2020/wordml/sdtdatahash" xmlns:w16se="http://schemas.microsoft.com/office/word/2015/wordml/symex" xmlns:wpg="http://schemas.microsoft.com/office/word/2010/wordprocessingGroup" xmlns:wpi="http://schemas.microsoft.com/office/word/2010/wordprocessingInk" xmlns:wne="http://schemas.microsoft.com/office/word/2006/wordml" xmlns:wps="http://schemas.microsoft.com/office/word/2010/wordprocessingShape" mc:Ignorable="w14 w15 w16se w16cid w16 w16cex w16sdtdh wp14">
+<w:hdr xmlns:wpc="http://schemas.microsoft.com/office/word/2010/wordprocessingCanvas" xmlns:cx="http://schemas.microsoft.com/office/drawing/2014/chartex" xmlns:cx1="http://schemas.microsoft.com/office/drawing/2015/9/8/chartex" xmlns:cx2="http://schemas.microsoft.com/office/drawing/2015/10/21/chartex" xmlns:cx3="http://schemas.microsoft.com/office/drawing/2016/5/9/chartex" xmlns:cx4="http://schemas.microsoft.com/office/drawing/2016/5/10/chartex" xmlns:cx5="http://schemas.microsoft.com/office/drawing/2016/5/11/chartex" xmlns:cx6="http://schemas.microsoft.com/office/drawing/2016/5/12/chartex" xmlns:cx7="http://schemas.microsoft.com/office/drawing/2016/5/13/chartex" xmlns:cx8="http://schemas.microsoft.com/office/drawing/2016/5/14/chartex" xmlns:mc="http://schemas.openxmlformats.org/markup-compatibility/2006" xmlns:aink="http://schemas.microsoft.com/office/drawing/2016/ink" xmlns:am3d="http://schemas.microsoft.com/office/drawing/2017/model3d" xmlns:o="urn:schemas-microsoft-com:office:office" xmlns:oel="http://schemas.microsoft.com/office/2019/extlst" xmlns:r="http://schemas.openxmlformats.org/officeDocument/2006/relationships" xmlns:m="http://schemas.openxmlformats.org/officeDocument/2006/math" xmlns:v="urn:schemas-microsoft-com:vml" xmlns:wp14="http://schemas.microsoft.com/office/word/2010/wordprocessingDrawing" xmlns:wp="http://schemas.openxmlformats.org/drawingml/2006/wordprocessingDrawing" xmlns:w10="urn:schemas-microsoft-com:office:word" xmlns:w="http://schemas.openxmlformats.org/wordprocessingml/2006/main" xmlns:w14="http://schemas.microsoft.com/office/word/2010/wordml" xmlns:w15="http://schemas.microsoft.com/office/word/2012/wordml" xmlns:w16cex="http://schemas.microsoft.com/office/word/2018/wordml/cex" xmlns:w16cid="http://schemas.microsoft.com/office/word/2016/wordml/cid" xmlns:w16="http://schemas.microsoft.com/office/word/2018/wordml" xmlns:w16du="http://schemas.microsoft.com/office/word/2023/wordml/word16du" xmlns:w16sdtdh="http://schemas.microsoft.com/office/word/2020/wordml/sdtdatahash" xmlns:w16sdtfl="http://schemas.microsoft.com/office/word/2024/wordml/sdtformatlock" xmlns:w16se="http://schemas.microsoft.com/office/word/2015/wordml/symex" xmlns:wpg="http://schemas.microsoft.com/office/word/2010/wordprocessingGroup" xmlns:wpi="http://schemas.microsoft.com/office/word/2010/wordprocessingInk" xmlns:wne="http://schemas.microsoft.com/office/word/2006/wordml" xmlns:wps="http://schemas.microsoft.com/office/word/2010/wordprocessingShape" mc:Ignorable="w14 w15 w16se w16cid w16 w16cex w16sdtdh w16sdtfl w16du wp14">
   <w:p>
     <w:pPr>
       <w:pStyle w:val="Header"/>
@@ -7222,11 +7219,11 @@
           <v:path o:extrusionok="f" gradientshapeok="t" o:connecttype="rect"/>
           <o:lock v:ext="edit" aspectratio="t"/>
         </v:shapetype>
-        <v:shape id="_x0000_s2050" type="#_x0000_t75" style="position:absolute;left:0;text-align:left;margin-left:79.15pt;margin-top:24.7pt;width:51.5pt;height:51.5pt;z-index:-251658240;visibility:visible;mso-wrap-edited:f;mso-position-horizontal-relative:page;mso-position-vertical-relative:page" wrapcoords="-223 0 -223 21377 21600 21377 21600 0 -223 0" o:allowincell="f" fillcolor="window">
+        <v:shape id="_x0000_s1026" type="#_x0000_t75" style="position:absolute;left:0;text-align:left;margin-left:79.15pt;margin-top:24.7pt;width:51.5pt;height:51.5pt;z-index:-251658240;visibility:visible;mso-wrap-edited:f;mso-position-horizontal-relative:page;mso-position-vertical-relative:page" wrapcoords="-223 0 -223 21377 21600 21377 21600 0 -223 0" o:allowincell="f" fillcolor="window">
           <v:imagedata r:id="rId1" o:title=""/>
           <w10:wrap anchorx="page" anchory="page"/>
         </v:shape>
-        <o:OLEObject Type="Embed" ProgID="Word.Picture.8" ShapeID="_x0000_s2050" DrawAspect="Content" ObjectID="_1682948486" r:id="rId2"/>
+        <o:OLEObject Type="Embed" ProgID="Word.Picture.8" ShapeID="_x0000_s1026" DrawAspect="Content" ObjectID="_1851487190" r:id="rId2"/>
       </w:object>
     </w:r>
     <w:r>
@@ -7243,7 +7240,7 @@
 </file>
 
 <file path=word/numbering.xml><?xml version="1.0" encoding="utf-8"?>
-<w:numbering xmlns:wpc="http://schemas.microsoft.com/office/word/2010/wordprocessingCanvas" xmlns:cx="http://schemas.microsoft.com/office/drawing/2014/chartex" xmlns:cx1="http://schemas.microsoft.com/office/drawing/2015/9/8/chartex" xmlns:cx2="http://schemas.microsoft.com/office/drawing/2015/10/21/chartex" xmlns:cx3="http://schemas.microsoft.com/office/drawing/2016/5/9/chartex" xmlns:cx4="http://schemas.microsoft.com/office/drawing/2016/5/10/chartex" xmlns:cx5="http://schemas.microsoft.com/office/drawing/2016/5/11/chartex" xmlns:cx6="http://schemas.microsoft.com/office/drawing/2016/5/12/chartex" xmlns:cx7="http://schemas.microsoft.com/office/drawing/2016/5/13/chartex" xmlns:cx8="http://schemas.microsoft.com/office/drawing/2016/5/14/chartex" xmlns:mc="http://schemas.openxmlformats.org/markup-compatibility/2006" xmlns:aink="http://schemas.microsoft.com/office/drawing/2016/ink" xmlns:am3d="http://schemas.microsoft.com/office/drawing/2017/model3d" xmlns:o="urn:schemas-microsoft-com:office:office" xmlns:r="http://schemas.openxmlformats.org/officeDocument/2006/relationships" xmlns:m="http://schemas.openxmlformats.org/officeDocument/2006/math" xmlns:v="urn:schemas-microsoft-com:vml" xmlns:wp14="http://schemas.microsoft.com/office/word/2010/wordprocessingDrawing" xmlns:wp="http://schemas.openxmlformats.org/drawingml/2006/wordprocessingDrawing" xmlns:w10="urn:schemas-microsoft-com:office:word" xmlns:w="http://schemas.openxmlformats.org/wordprocessingml/2006/main" xmlns:w14="http://schemas.microsoft.com/office/word/2010/wordml" xmlns:w15="http://schemas.microsoft.com/office/word/2012/wordml" xmlns:w16cex="http://schemas.microsoft.com/office/word/2018/wordml/cex" xmlns:w16cid="http://schemas.microsoft.com/office/word/2016/wordml/cid" xmlns:w16="http://schemas.microsoft.com/office/word/2018/wordml" xmlns:w16sdtdh="http://schemas.microsoft.com/office/word/2020/wordml/sdtdatahash" xmlns:w16se="http://schemas.microsoft.com/office/word/2015/wordml/symex" xmlns:wpg="http://schemas.microsoft.com/office/word/2010/wordprocessingGroup" xmlns:wpi="http://schemas.microsoft.com/office/word/2010/wordprocessingInk" xmlns:wne="http://schemas.microsoft.com/office/word/2006/wordml" xmlns:wps="http://schemas.microsoft.com/office/word/2010/wordprocessingShape" mc:Ignorable="w14 w15 w16se w16cid w16 w16cex w16sdtdh wp14">
+<w:numbering xmlns:wpc="http://schemas.microsoft.com/office/word/2010/wordprocessingCanvas" xmlns:cx="http://schemas.microsoft.com/office/drawing/2014/chartex" xmlns:cx1="http://schemas.microsoft.com/office/drawing/2015/9/8/chartex" xmlns:cx2="http://schemas.microsoft.com/office/drawing/2015/10/21/chartex" xmlns:cx3="http://schemas.microsoft.com/office/drawing/2016/5/9/chartex" xmlns:cx4="http://schemas.microsoft.com/office/drawing/2016/5/10/chartex" xmlns:cx5="http://schemas.microsoft.com/office/drawing/2016/5/11/chartex" xmlns:cx6="http://schemas.microsoft.com/office/drawing/2016/5/12/chartex" xmlns:cx7="http://schemas.microsoft.com/office/drawing/2016/5/13/chartex" xmlns:cx8="http://schemas.microsoft.com/office/drawing/2016/5/14/chartex" xmlns:mc="http://schemas.openxmlformats.org/markup-compatibility/2006" xmlns:aink="http://schemas.microsoft.com/office/drawing/2016/ink" xmlns:am3d="http://schemas.microsoft.com/office/drawing/2017/model3d" xmlns:o="urn:schemas-microsoft-com:office:office" xmlns:oel="http://schemas.microsoft.com/office/2019/extlst" xmlns:r="http://schemas.openxmlformats.org/officeDocument/2006/relationships" xmlns:m="http://schemas.openxmlformats.org/officeDocument/2006/math" xmlns:v="urn:schemas-microsoft-com:vml" xmlns:wp14="http://schemas.microsoft.com/office/word/2010/wordprocessingDrawing" xmlns:wp="http://schemas.openxmlformats.org/drawingml/2006/wordprocessingDrawing" xmlns:w10="urn:schemas-microsoft-com:office:word" xmlns:w="http://schemas.openxmlformats.org/wordprocessingml/2006/main" xmlns:w14="http://schemas.microsoft.com/office/word/2010/wordml" xmlns:w15="http://schemas.microsoft.com/office/word/2012/wordml" xmlns:w16cex="http://schemas.microsoft.com/office/word/2018/wordml/cex" xmlns:w16cid="http://schemas.microsoft.com/office/word/2016/wordml/cid" xmlns:w16="http://schemas.microsoft.com/office/word/2018/wordml" xmlns:w16du="http://schemas.microsoft.com/office/word/2023/wordml/word16du" xmlns:w16sdtdh="http://schemas.microsoft.com/office/word/2020/wordml/sdtdatahash" xmlns:w16sdtfl="http://schemas.microsoft.com/office/word/2024/wordml/sdtformatlock" xmlns:w16se="http://schemas.microsoft.com/office/word/2015/wordml/symex" xmlns:wpg="http://schemas.microsoft.com/office/word/2010/wordprocessingGroup" xmlns:wpi="http://schemas.microsoft.com/office/word/2010/wordprocessingInk" xmlns:wne="http://schemas.microsoft.com/office/word/2006/wordml" xmlns:wps="http://schemas.microsoft.com/office/word/2010/wordprocessingShape" mc:Ignorable="w14 w15 w16se w16cid w16 w16cex w16sdtdh w16sdtfl w16du wp14">
   <w:abstractNum w:abstractNumId="0" w15:restartNumberingAfterBreak="0">
     <w:nsid w:val="FFFFFFFB"/>
     <w:multiLevelType w:val="multilevel"/>
@@ -9540,79 +9537,79 @@
       </w:pPr>
     </w:lvl>
   </w:abstractNum>
-  <w:num w:numId="1">
+  <w:num w:numId="1" w16cid:durableId="1563174887">
     <w:abstractNumId w:val="20"/>
   </w:num>
-  <w:num w:numId="2">
+  <w:num w:numId="2" w16cid:durableId="711614130">
     <w:abstractNumId w:val="2"/>
   </w:num>
-  <w:num w:numId="3">
+  <w:num w:numId="3" w16cid:durableId="1075394538">
     <w:abstractNumId w:val="0"/>
   </w:num>
-  <w:num w:numId="4">
+  <w:num w:numId="4" w16cid:durableId="2027249711">
     <w:abstractNumId w:val="0"/>
   </w:num>
-  <w:num w:numId="5">
+  <w:num w:numId="5" w16cid:durableId="901789448">
     <w:abstractNumId w:val="0"/>
   </w:num>
-  <w:num w:numId="6">
+  <w:num w:numId="6" w16cid:durableId="438647706">
     <w:abstractNumId w:val="0"/>
   </w:num>
-  <w:num w:numId="7">
+  <w:num w:numId="7" w16cid:durableId="279335809">
     <w:abstractNumId w:val="0"/>
   </w:num>
-  <w:num w:numId="8">
+  <w:num w:numId="8" w16cid:durableId="1254238370">
     <w:abstractNumId w:val="0"/>
   </w:num>
-  <w:num w:numId="9">
+  <w:num w:numId="9" w16cid:durableId="1321345342">
     <w:abstractNumId w:val="0"/>
   </w:num>
-  <w:num w:numId="10">
+  <w:num w:numId="10" w16cid:durableId="104813005">
     <w:abstractNumId w:val="0"/>
   </w:num>
-  <w:num w:numId="11">
+  <w:num w:numId="11" w16cid:durableId="1348947579">
     <w:abstractNumId w:val="0"/>
   </w:num>
-  <w:num w:numId="12">
+  <w:num w:numId="12" w16cid:durableId="304093129">
     <w:abstractNumId w:val="22"/>
   </w:num>
-  <w:num w:numId="13">
+  <w:num w:numId="13" w16cid:durableId="138033001">
     <w:abstractNumId w:val="19"/>
   </w:num>
-  <w:num w:numId="14">
+  <w:num w:numId="14" w16cid:durableId="679623380">
     <w:abstractNumId w:val="20"/>
   </w:num>
-  <w:num w:numId="15">
+  <w:num w:numId="15" w16cid:durableId="834422014">
     <w:abstractNumId w:val="20"/>
   </w:num>
-  <w:num w:numId="16">
+  <w:num w:numId="16" w16cid:durableId="2041859011">
     <w:abstractNumId w:val="20"/>
   </w:num>
-  <w:num w:numId="17">
+  <w:num w:numId="17" w16cid:durableId="1165824653">
     <w:abstractNumId w:val="20"/>
   </w:num>
-  <w:num w:numId="18">
+  <w:num w:numId="18" w16cid:durableId="227620145">
     <w:abstractNumId w:val="20"/>
   </w:num>
-  <w:num w:numId="19">
+  <w:num w:numId="19" w16cid:durableId="1282691481">
     <w:abstractNumId w:val="20"/>
   </w:num>
-  <w:num w:numId="20">
+  <w:num w:numId="20" w16cid:durableId="248388389">
     <w:abstractNumId w:val="20"/>
   </w:num>
-  <w:num w:numId="21">
+  <w:num w:numId="21" w16cid:durableId="1194614814">
     <w:abstractNumId w:val="20"/>
   </w:num>
-  <w:num w:numId="22">
+  <w:num w:numId="22" w16cid:durableId="1806583239">
     <w:abstractNumId w:val="3"/>
   </w:num>
-  <w:num w:numId="23">
+  <w:num w:numId="23" w16cid:durableId="284770506">
     <w:abstractNumId w:val="6"/>
   </w:num>
-  <w:num w:numId="24">
+  <w:num w:numId="24" w16cid:durableId="1640576455">
     <w:abstractNumId w:val="21"/>
   </w:num>
-  <w:num w:numId="25">
+  <w:num w:numId="25" w16cid:durableId="774056850">
     <w:abstractNumId w:val="1"/>
     <w:lvlOverride w:ilvl="0">
       <w:lvl w:ilvl="0">
@@ -9630,61 +9627,61 @@
       </w:lvl>
     </w:lvlOverride>
   </w:num>
-  <w:num w:numId="26">
+  <w:num w:numId="26" w16cid:durableId="696783386">
     <w:abstractNumId w:val="10"/>
   </w:num>
-  <w:num w:numId="27">
+  <w:num w:numId="27" w16cid:durableId="366681086">
     <w:abstractNumId w:val="0"/>
   </w:num>
-  <w:num w:numId="28">
+  <w:num w:numId="28" w16cid:durableId="2091081559">
     <w:abstractNumId w:val="11"/>
   </w:num>
-  <w:num w:numId="29">
+  <w:num w:numId="29" w16cid:durableId="2108891170">
     <w:abstractNumId w:val="17"/>
   </w:num>
-  <w:num w:numId="30">
+  <w:num w:numId="30" w16cid:durableId="168298736">
     <w:abstractNumId w:val="7"/>
   </w:num>
-  <w:num w:numId="31">
+  <w:num w:numId="31" w16cid:durableId="813989121">
     <w:abstractNumId w:val="8"/>
   </w:num>
-  <w:num w:numId="32">
+  <w:num w:numId="32" w16cid:durableId="1656645363">
     <w:abstractNumId w:val="15"/>
   </w:num>
-  <w:num w:numId="33">
+  <w:num w:numId="33" w16cid:durableId="1123156471">
     <w:abstractNumId w:val="9"/>
   </w:num>
-  <w:num w:numId="34">
+  <w:num w:numId="34" w16cid:durableId="846941596">
     <w:abstractNumId w:val="18"/>
   </w:num>
-  <w:num w:numId="35">
+  <w:num w:numId="35" w16cid:durableId="2107726746">
     <w:abstractNumId w:val="12"/>
   </w:num>
-  <w:num w:numId="36">
+  <w:num w:numId="36" w16cid:durableId="648247143">
     <w:abstractNumId w:val="4"/>
   </w:num>
-  <w:num w:numId="37">
+  <w:num w:numId="37" w16cid:durableId="1587156709">
     <w:abstractNumId w:val="23"/>
   </w:num>
-  <w:num w:numId="38">
+  <w:num w:numId="38" w16cid:durableId="1097139124">
     <w:abstractNumId w:val="5"/>
   </w:num>
-  <w:num w:numId="39">
+  <w:num w:numId="39" w16cid:durableId="766970443">
     <w:abstractNumId w:val="0"/>
   </w:num>
-  <w:num w:numId="40">
+  <w:num w:numId="40" w16cid:durableId="560560477">
     <w:abstractNumId w:val="0"/>
   </w:num>
-  <w:num w:numId="41">
+  <w:num w:numId="41" w16cid:durableId="658583236">
     <w:abstractNumId w:val="0"/>
   </w:num>
-  <w:num w:numId="42">
+  <w:num w:numId="42" w16cid:durableId="101268254">
     <w:abstractNumId w:val="14"/>
   </w:num>
-  <w:num w:numId="43">
+  <w:num w:numId="43" w16cid:durableId="562637653">
     <w:abstractNumId w:val="16"/>
   </w:num>
-  <w:num w:numId="44">
+  <w:num w:numId="44" w16cid:durableId="490800383">
     <w:abstractNumId w:val="13"/>
   </w:num>
   <w:numIdMacAtCleanup w:val="11"/>
@@ -9692,7 +9689,7 @@
 </file>
 
 <file path=word/styles.xml><?xml version="1.0" encoding="utf-8"?>
-<w:styles xmlns:mc="http://schemas.openxmlformats.org/markup-compatibility/2006" xmlns:r="http://schemas.openxmlformats.org/officeDocument/2006/relationships" xmlns:w="http://schemas.openxmlformats.org/wordprocessingml/2006/main" xmlns:w14="http://schemas.microsoft.com/office/word/2010/wordml" xmlns:w15="http://schemas.microsoft.com/office/word/2012/wordml" xmlns:w16cex="http://schemas.microsoft.com/office/word/2018/wordml/cex" xmlns:w16cid="http://schemas.microsoft.com/office/word/2016/wordml/cid" xmlns:w16="http://schemas.microsoft.com/office/word/2018/wordml" xmlns:w16sdtdh="http://schemas.microsoft.com/office/word/2020/wordml/sdtdatahash" xmlns:w16se="http://schemas.microsoft.com/office/word/2015/wordml/symex" mc:Ignorable="w14 w15 w16se w16cid w16 w16cex w16sdtdh">
+<w:styles xmlns:mc="http://schemas.openxmlformats.org/markup-compatibility/2006" xmlns:r="http://schemas.openxmlformats.org/officeDocument/2006/relationships" xmlns:w="http://schemas.openxmlformats.org/wordprocessingml/2006/main" xmlns:w14="http://schemas.microsoft.com/office/word/2010/wordml" xmlns:w15="http://schemas.microsoft.com/office/word/2012/wordml" xmlns:w16cex="http://schemas.microsoft.com/office/word/2018/wordml/cex" xmlns:w16cid="http://schemas.microsoft.com/office/word/2016/wordml/cid" xmlns:w16="http://schemas.microsoft.com/office/word/2018/wordml" xmlns:w16du="http://schemas.microsoft.com/office/word/2023/wordml/word16du" xmlns:w16sdtdh="http://schemas.microsoft.com/office/word/2020/wordml/sdtdatahash" xmlns:w16sdtfl="http://schemas.microsoft.com/office/word/2024/wordml/sdtformatlock" xmlns:w16se="http://schemas.microsoft.com/office/word/2015/wordml/symex" mc:Ignorable="w14 w15 w16se w16cid w16 w16cex w16sdtdh w16sdtfl w16du">
   <w:docDefaults>
     <w:rPrDefault>
       <w:rPr>
@@ -11149,12 +11146,7 @@
 </file>
 
 <file path=customXml/item2.xml><?xml version="1.0" encoding="utf-8"?>
-<?mso-contentType ?>
-<FormTemplates xmlns="http://schemas.microsoft.com/sharepoint/v3/contenttype/forms">
-  <Display>DocumentLibraryForm</Display>
-  <Edit>DocumentLibraryForm</Edit>
-  <New>DocumentLibraryForm</New>
-</FormTemplates>
+<b:Sources xmlns:b="http://schemas.openxmlformats.org/officeDocument/2006/bibliography" xmlns="http://schemas.openxmlformats.org/officeDocument/2006/bibliography" SelectedStyle="\APA.XSL" StyleName="APA"/>
 </file>
 
 <file path=customXml/item3.xml><?xml version="1.0" encoding="utf-8"?>
@@ -11182,10 +11174,6 @@
 </file>
 
 <file path=customXml/item4.xml><?xml version="1.0" encoding="utf-8"?>
-<b:Sources xmlns:b="http://schemas.openxmlformats.org/officeDocument/2006/bibliography" xmlns="http://schemas.openxmlformats.org/officeDocument/2006/bibliography" SelectedStyle="\APA.XSL" StyleName="APA"/>
-</file>
-
-<file path=customXml/item5.xml><?xml version="1.0" encoding="utf-8"?>
 <ct:contentTypeSchema xmlns:ct="http://schemas.microsoft.com/office/2006/metadata/contentType" xmlns:ma="http://schemas.microsoft.com/office/2006/metadata/properties/metaAttributes" ct:_="" ma:_="" ma:contentTypeName="Document" ma:contentTypeID="0x010100CF77B00A079C0E47B36F55385A506601" ma:contentTypeVersion="14" ma:contentTypeDescription="Create a new document." ma:contentTypeScope="" ma:versionID="1e6a9991abe4a8db828e8294782d5b88">
   <xsd:schema xmlns:xsd="http://www.w3.org/2001/XMLSchema" xmlns:p="http://schemas.microsoft.com/office/2006/metadata/properties" xmlns:ns1="http://schemas.microsoft.com/sharepoint/v3" xmlns:ns2="5aa1fa6d-cbed-4e3d-8693-9604ffad73e0" xmlns:ns4="f76cf71e-700a-48b0-8525-d7cfe2f64198" targetNamespace="http://schemas.microsoft.com/office/2006/metadata/properties" ma:root="true" ma:fieldsID="81d1ed7869e6246f7979ca82aa696356" ns1:_="" ns2:_="" ns4:_="">
     <xsd:import namespace="http://schemas.microsoft.com/sharepoint/v3"/>
@@ -11334,6 +11322,15 @@
 </ct:contentTypeSchema>
 </file>
 
+<file path=customXml/item5.xml><?xml version="1.0" encoding="utf-8"?>
+<?mso-contentType ?>
+<FormTemplates xmlns="http://schemas.microsoft.com/sharepoint/v3/contenttype/forms">
+  <Display>DocumentLibraryForm</Display>
+  <Edit>DocumentLibraryForm</Edit>
+  <New>DocumentLibraryForm</New>
+</FormTemplates>
+</file>
+
 <file path=customXml/itemProps1.xml><?xml version="1.0" encoding="utf-8"?>
 <ds:datastoreItem xmlns:ds="http://schemas.openxmlformats.org/officeDocument/2006/customXml" ds:itemID="{0CE83F6A-E3C1-4197-8169-A2FB5E137D32}">
   <ds:schemaRefs>
@@ -11343,9 +11340,9 @@
 </file>
 
 <file path=customXml/itemProps2.xml><?xml version="1.0" encoding="utf-8"?>
-<ds:datastoreItem xmlns:ds="http://schemas.openxmlformats.org/officeDocument/2006/customXml" ds:itemID="{02AB5B96-056F-4E5D-92C6-AF1A99A795BB}">
+<ds:datastoreItem xmlns:ds="http://schemas.openxmlformats.org/officeDocument/2006/customXml" ds:itemID="{14C02526-76DA-400E-9667-5DED4821B7F1}">
   <ds:schemaRefs>
-    <ds:schemaRef ds:uri="http://schemas.microsoft.com/sharepoint/v3/contenttype/forms"/>
+    <ds:schemaRef ds:uri="http://schemas.openxmlformats.org/officeDocument/2006/bibliography"/>
   </ds:schemaRefs>
 </ds:datastoreItem>
 </file>
@@ -11363,14 +11360,6 @@
 </file>
 
 <file path=customXml/itemProps4.xml><?xml version="1.0" encoding="utf-8"?>
-<ds:datastoreItem xmlns:ds="http://schemas.openxmlformats.org/officeDocument/2006/customXml" ds:itemID="{14C02526-76DA-400E-9667-5DED4821B7F1}">
-  <ds:schemaRefs>
-    <ds:schemaRef ds:uri="http://schemas.openxmlformats.org/officeDocument/2006/bibliography"/>
-  </ds:schemaRefs>
-</ds:datastoreItem>
-</file>
-
-<file path=customXml/itemProps5.xml><?xml version="1.0" encoding="utf-8"?>
 <ds:datastoreItem xmlns:ds="http://schemas.openxmlformats.org/officeDocument/2006/customXml" ds:itemID="{6456B04A-9003-416D-8D80-469E3CAB8C98}">
   <ds:schemaRefs>
     <ds:schemaRef ds:uri="http://schemas.microsoft.com/office/2006/metadata/contentType"/>
@@ -11387,4 +11376,12 @@
     <ds:schemaRef ds:uri="http://schemas.microsoft.com/office/internal/2005/internalDocumentation"/>
   </ds:schemaRefs>
 </ds:datastoreItem>
+</file>
+
+<file path=customXml/itemProps5.xml><?xml version="1.0" encoding="utf-8"?>
+<ds:datastoreItem xmlns:ds="http://schemas.openxmlformats.org/officeDocument/2006/customXml" ds:itemID="{02AB5B96-056F-4E5D-92C6-AF1A99A795BB}">
+  <ds:schemaRefs>
+    <ds:schemaRef ds:uri="http://schemas.microsoft.com/sharepoint/v3/contenttype/forms"/>
+  </ds:schemaRefs>
+</ds:datastoreItem>
 </file>
</xml_diff>